<commit_message>
lab2: check INSERT prepare result; refresh reports
</commit_message>
<xml_diff>
--- a/reports/Лаба1.docx
+++ b/reports/Лаба1.docx
@@ -900,7 +900,7 @@
             </w:rPr>
             <w:fldChar w:fldCharType="separate"/>
           </w:r>
-          <w:hyperlink w:anchor="_Toc243845132" w:history="1">
+          <w:hyperlink w:anchor="_Toc243845255" w:history="1">
             <w:r>
               <w:rPr>
                 <w:rStyle w:val="ac"/>
@@ -931,7 +931,7 @@
                 <w:noProof/>
                 <w:webHidden/>
               </w:rPr>
-              <w:instrText xml:space="preserve"> PAGEREF _Toc243845132 \h </w:instrText>
+              <w:instrText xml:space="preserve"> PAGEREF _Toc243845255 \h </w:instrText>
             </w:r>
             <w:r>
               <w:rPr>
@@ -976,7 +976,7 @@
               <w:lang w:eastAsia="ru-RU"/>
             </w:rPr>
           </w:pPr>
-          <w:hyperlink w:anchor="_Toc243845133" w:history="1">
+          <w:hyperlink w:anchor="_Toc243845256" w:history="1">
             <w:r>
               <w:rPr>
                 <w:rStyle w:val="ac"/>
@@ -1007,7 +1007,7 @@
                 <w:noProof/>
                 <w:webHidden/>
               </w:rPr>
-              <w:instrText xml:space="preserve"> PAGEREF _Toc243845133 \h </w:instrText>
+              <w:instrText xml:space="preserve"> PAGEREF _Toc243845256 \h </w:instrText>
             </w:r>
             <w:r>
               <w:rPr>
@@ -1052,7 +1052,7 @@
               <w:lang w:eastAsia="ru-RU"/>
             </w:rPr>
           </w:pPr>
-          <w:hyperlink w:anchor="_Toc243845134" w:history="1">
+          <w:hyperlink w:anchor="_Toc243845257" w:history="1">
             <w:r>
               <w:rPr>
                 <w:rStyle w:val="ac"/>
@@ -1083,7 +1083,7 @@
                 <w:noProof/>
                 <w:webHidden/>
               </w:rPr>
-              <w:instrText xml:space="preserve"> PAGEREF _Toc243845134 \h </w:instrText>
+              <w:instrText xml:space="preserve"> PAGEREF _Toc243845257 \h </w:instrText>
             </w:r>
             <w:r>
               <w:rPr>
@@ -1128,7 +1128,7 @@
               <w:lang w:eastAsia="ru-RU"/>
             </w:rPr>
           </w:pPr>
-          <w:hyperlink w:anchor="_Toc243845135" w:history="1">
+          <w:hyperlink w:anchor="_Toc243845258" w:history="1">
             <w:r>
               <w:rPr>
                 <w:rStyle w:val="ac"/>
@@ -1159,7 +1159,7 @@
                 <w:noProof/>
                 <w:webHidden/>
               </w:rPr>
-              <w:instrText xml:space="preserve"> PAGEREF _Toc243845135 \h </w:instrText>
+              <w:instrText xml:space="preserve"> PAGEREF _Toc243845258 \h </w:instrText>
             </w:r>
             <w:r>
               <w:rPr>
@@ -1258,7 +1258,7 @@
         </w:rPr>
       </w:pPr>
       <w:bookmarkStart w:id="0" w:name="_Toc90000101"/>
-      <w:bookmarkStart w:id="1" w:name="_Toc243845132"/>
+      <w:bookmarkStart w:id="1" w:name="_Toc243845255"/>
       <w:r>
         <w:rPr>
           <w:rFonts w:ascii="Times New Roman" w:eastAsia="Times New Roman" w:hAnsi="Times New Roman" w:cs="Times New Roman"/>
@@ -1472,7 +1472,7 @@
         </w:rPr>
       </w:pPr>
       <w:bookmarkStart w:id="2" w:name="_Toc90000102"/>
-      <w:bookmarkStart w:id="3" w:name="_Toc243845133"/>
+      <w:bookmarkStart w:id="3" w:name="_Toc243845256"/>
       <w:r>
         <w:rPr>
           <w:rFonts w:ascii="Times New Roman" w:eastAsia="Times New Roman" w:hAnsi="Times New Roman" w:cs="Times New Roman"/>
@@ -1824,7 +1824,7 @@
           <w:noProof/>
         </w:rPr>
         <w:drawing>
-          <wp:inline distT="0" distB="0" distL="0" distR="0" wp14:anchorId="3793865B" wp14:editId="319612D9">
+          <wp:inline distT="0" distB="0" distL="0" distR="0" wp14:anchorId="0B39CAA7" wp14:editId="4320323F">
             <wp:extent cx="5743118" cy="7559999"/>
             <wp:effectExtent l="0" t="0" r="0" b="0"/>
             <wp:docPr id="1" name="Picture 1"/>
@@ -1934,7 +1934,7 @@
           <w:noProof/>
         </w:rPr>
         <w:drawing>
-          <wp:inline distT="0" distB="0" distL="0" distR="0" wp14:anchorId="655DD4BD" wp14:editId="5BB7428E">
+          <wp:inline distT="0" distB="0" distL="0" distR="0" wp14:anchorId="453482F6" wp14:editId="0A90FCAC">
             <wp:extent cx="5743118" cy="7559999"/>
             <wp:effectExtent l="0" t="0" r="0" b="0"/>
             <wp:docPr id="2" name="Picture 2"/>
@@ -2044,7 +2044,7 @@
           <w:noProof/>
         </w:rPr>
         <w:drawing>
-          <wp:inline distT="0" distB="0" distL="0" distR="0" wp14:anchorId="20813102" wp14:editId="1741D107">
+          <wp:inline distT="0" distB="0" distL="0" distR="0" wp14:anchorId="773A1C23" wp14:editId="0B5659C3">
             <wp:extent cx="5743118" cy="7559999"/>
             <wp:effectExtent l="0" t="0" r="0" b="0"/>
             <wp:docPr id="3" name="Picture 3"/>
@@ -2152,7 +2152,7 @@
         </w:rPr>
       </w:pPr>
       <w:bookmarkStart w:id="4" w:name="_Toc90000103"/>
-      <w:bookmarkStart w:id="5" w:name="_Toc243845134"/>
+      <w:bookmarkStart w:id="5" w:name="_Toc243845257"/>
       <w:r>
         <w:rPr>
           <w:rFonts w:ascii="Times New Roman" w:eastAsia="Times New Roman" w:hAnsi="Times New Roman" w:cs="Times New Roman"/>
@@ -2393,7 +2393,7 @@
         </w:rPr>
       </w:pPr>
       <w:bookmarkStart w:id="6" w:name="_Toc90000104"/>
-      <w:bookmarkStart w:id="7" w:name="_Toc243845135"/>
+      <w:bookmarkStart w:id="7" w:name="_Toc243845258"/>
       <w:r>
         <w:rPr>
           <w:rFonts w:ascii="Times New Roman" w:eastAsia="Times New Roman" w:hAnsi="Times New Roman" w:cs="Times New Roman"/>

</xml_diff>